<commit_message>
Refine BUS 1102-01 Unit 4 essay: match student voice, sharpen fraud-vs-mistake distinction
</commit_message>
<xml_diff>
--- a/Term_02/BUS 1102-01 Basic Accounting - AY2027-T1/Assignments/Unit4_Assignment.docx
+++ b/Term_02/BUS 1102-01 Basic Accounting - AY2027-T1/Assignments/Unit4_Assignment.docx
@@ -119,7 +119,7 @@
           <w:b w:val="0"/>
           <w:i w:val="0"/>
         </w:rPr>
-        <w:t>April's sales journal has five problems, although its dates are all present and in order. First, the April 4 entry repeats invoice #1 to Customer A for $3,000, which was already recorded on April 1. One invoice means one sale, so the duplicate should be deleted (see Table 1). Second, invoice #7 to Customer G on April 18 has no amount. It must be traced to the original invoice, since a journal only works as an audit trail when every line matches a source document (Franklin et al., 2022). Third, the journal has no total. As listed, the entries add up to $42,800; without the duplicate, the corrected total is $39,800 plus Customer G's unknown amount, the figure to post to Accounts Receivable and Sales. Fourth, some amounts look suspicious. The $10,000 sale to Customer J on April 27 is round, double the next-largest sale, and lands just before month-end, while Customers E and F ($2,800) and H and I ($5,000) come in identical back-to-back pairs. Each should be verified against invoices and shipping records. Finally, April's invoices stop at #11 but May's start at #110, leaving #12–109 unaccounted for.</w:t>
+        <w:t>The clearest error in April's sales journal is on April 4, where Customer A's invoice #1 for $3,000 repeats the April 1 entry. One invoice means one sale, so that line should be deleted (see Table 1). Invoice #7 to Customer G on April 18 has the opposite problem: no amount. Rather than guessing, it must be checked against the original invoice, since a journal only works as an audit trail when every line traces back to a source document (Franklin et al., 2022). The journal also has no total. As listed, the entries add up to $42,800, but without the duplicate the corrected total is $39,800 plus invoice #7, the figure to post to Accounts Receivable and Sales. The dates are all present and in order, but some amounts look suspicious. Customer J's $10,000 sale on April 27 is round, double the next-largest sale, and lands right before month-end, while Customers E and F ($2,800) and H and I ($5,000) come in identical back-to-back pairs. Those stay but need checking against invoices and shipping records. Finally, April's invoices stop at #11 while May's start at #110, so #12–109 must be located or documented as voided.</w:t>
       </w:r>
     </w:p>
     <w:p>
@@ -1585,7 +1585,7 @@
           <w:b w:val="0"/>
           <w:i w:val="0"/>
         </w:rPr>
-        <w:t>Intent is what separates the two. The Public Company Accounting Oversight Board (PCAOB, n.d.) names it the primary factor distinguishing fraud from error, and OpenStax defines fraud as intentional deception for some benefit (Franklin et al., 2022). Some problems look like honest mistakes. Customer G's missing amount is most likely an omission, and matching amounts could simply reflect standard pricing. Others are harder to explain innocently. The duplicate reuses the exact customer, invoice number, and amount three days later, which is exactly how a fake sale inflating revenue would look. The $10,000 sale fits this pattern, since fraudulent entries are often made at the end of a reporting period (PCAOB, n.d.). May shows warning signs too: invoice #111 is missing, #116 is dated before #115, #113 and #114 appear on payments instead of sales, and equipment bought on #134 was paid under #114. Customer B's $2,000 payment also doesn't match its only recorded invoice ($2,200). None of this proves intent, but together I think the pattern points toward potential fraud, so Star Tech should investigate before closing April rather than quietly correcting the entries.</w:t>
+        <w:t>Whether this is fraud or carelessness comes down to intent. The Public Company Accounting Oversight Board (PCAOB, n.d.) names it the primary factor distinguishing fraud from error, and OpenStax defines fraud as intentional deception for some benefit (Franklin et al., 2022). Some problems honestly look like mistakes. A missing amount is most likely an omission, and two customers with the same total could just reflect standard pricing. The duplicate is harder to explain away, since it repeats the exact customer, invoice number, and amount three days later, just as a fake sale padding revenue would. The $10,000 sale fits too, because fraudulent entries are often made at the end of a reporting period (PCAOB, n.d.). May doesn't ease the concern: invoice #111 is missing, #116 is dated before #115, #113 and #114 show up on payments instead of sales, and equipment bought on #134 was paid under #114. Customer B's $2,000 payment doesn't match its only recorded invoice ($2,200). None of this proves intent, but together I think it points toward potential fraud, so Star Tech should investigate before closing April instead of quietly fixing the entries.</w:t>
       </w:r>
     </w:p>
     <w:p>
@@ -1610,7 +1610,7 @@
           <w:b w:val="0"/>
           <w:i w:val="0"/>
         </w:rPr>
-        <w:t>These issues trace back to perceived opportunity, the fraud-triangle element that internal controls can reduce (Franklin et al., 2022). More than half of recent fraud cases involved missing or overridden controls (Association of Certified Fraud Examiners, 2026), so each fix below targets a gap. For accuracy, the system should generate prenumbered invoices automatically, reject duplicate invoice numbers, and refuse to save a sale without an amount, backed by a monthly sequence check covering every number. Sales journal totals should be reconciled to the accounts receivable subsidiary ledger each month (Franklin et al., 2022). For security, the person who records sales should not also collect customer payments or pay suppliers, and password-protected access should log who creates or edits each entry (Franklin et al., 2022). For fraud detection, a manager should approve unusually large or round sales, especially near month-end, and confirm them with customers. Surprise audits, data monitoring, and an anonymous reporting channel help too, since tips uncovered 43% of frauds (Association of Certified Fraud Examiners, 2026). Monitoring, one of the five components of internal control, keeps these controls working as the business grows (Edspira, 2019).</w:t>
+        <w:t>These problems come back to perceived opportunity, the fraud-triangle element that internal controls can actually reduce (Franklin et al., 2022). More than half of recent fraud cases involved missing or overridden controls (Association of Certified Fraud Examiners, 2026). For accuracy, the system should number invoices automatically, reject repeated numbers, and refuse to save a sale without an amount, with a monthly sequence check. The sales journal total should be reconciled to the accounts receivable subsidiary ledger each month (Franklin et al., 2022). For security, whoever records sales shouldn't also collect customer payments or pay suppliers, and password-protected access should log who creates or edits each entry (Franklin et al., 2022). For fraud detection, a manager should approve unusually large or round sales, especially near month-end, and confirm them with customers. Surprise audits, data monitoring, and an anonymous reporting channel help too, since tips uncovered 43% of frauds (Association of Certified Fraud Examiners, 2026). Monitoring is one of the five components of internal control for a reason (Edspira, 2019): controls only work if someone keeps checking them.</w:t>
       </w:r>
       <w:r>
         <w:br w:type="page"/>

</xml_diff>